<commit_message>
Minor formatting change in page 3
</commit_message>
<xml_diff>
--- a/sandbox_ac/final_project_scope_V7_Final.docx
+++ b/sandbox_ac/final_project_scope_V7_Final.docx
@@ -6403,7 +6403,7 @@
           <w:ilvl w:val="0"/>
           <w:numId w:val="5"/>
         </w:numPr>
-        <w:spacing w:line="320" w:lineRule="exact"/>
+        <w:spacing w:before="120" w:after="120" w:line="320" w:lineRule="exact"/>
         <w:jc w:val="both"/>
       </w:pPr>
       <w:r>
@@ -6426,7 +6426,7 @@
           <w:ilvl w:val="0"/>
           <w:numId w:val="5"/>
         </w:numPr>
-        <w:spacing w:line="320" w:lineRule="exact"/>
+        <w:spacing w:before="120" w:after="120" w:line="320" w:lineRule="exact"/>
         <w:jc w:val="both"/>
       </w:pPr>
       <w:r>
@@ -6443,7 +6443,7 @@
           <w:ilvl w:val="0"/>
           <w:numId w:val="5"/>
         </w:numPr>
-        <w:spacing w:line="320" w:lineRule="exact"/>
+        <w:spacing w:before="120" w:after="120" w:line="320" w:lineRule="exact"/>
         <w:jc w:val="both"/>
       </w:pPr>
       <w:r>
@@ -6460,7 +6460,7 @@
           <w:ilvl w:val="0"/>
           <w:numId w:val="5"/>
         </w:numPr>
-        <w:spacing w:line="320" w:lineRule="exact"/>
+        <w:spacing w:before="120" w:after="120" w:line="320" w:lineRule="exact"/>
         <w:jc w:val="both"/>
       </w:pPr>
       <w:r>
@@ -6478,7 +6478,7 @@
           <w:ilvl w:val="0"/>
           <w:numId w:val="5"/>
         </w:numPr>
-        <w:spacing w:line="320" w:lineRule="exact"/>
+        <w:spacing w:before="120" w:after="120" w:line="320" w:lineRule="exact"/>
         <w:jc w:val="both"/>
       </w:pPr>
       <w:r>
@@ -6501,7 +6501,7 @@
           <w:ilvl w:val="0"/>
           <w:numId w:val="5"/>
         </w:numPr>
-        <w:spacing w:line="320" w:lineRule="exact"/>
+        <w:spacing w:before="120" w:after="120" w:line="320" w:lineRule="exact"/>
         <w:jc w:val="both"/>
       </w:pPr>
       <w:r>
@@ -6518,7 +6518,7 @@
           <w:ilvl w:val="0"/>
           <w:numId w:val="5"/>
         </w:numPr>
-        <w:spacing w:line="320" w:lineRule="exact"/>
+        <w:spacing w:before="120" w:after="120" w:line="320" w:lineRule="exact"/>
         <w:jc w:val="both"/>
       </w:pPr>
       <w:r>
@@ -6535,7 +6535,7 @@
           <w:ilvl w:val="0"/>
           <w:numId w:val="5"/>
         </w:numPr>
-        <w:spacing w:line="320" w:lineRule="exact"/>
+        <w:spacing w:before="120" w:after="120" w:line="320" w:lineRule="exact"/>
         <w:jc w:val="both"/>
       </w:pPr>
       <w:r>
@@ -6552,7 +6552,7 @@
           <w:ilvl w:val="0"/>
           <w:numId w:val="5"/>
         </w:numPr>
-        <w:spacing w:line="320" w:lineRule="exact"/>
+        <w:spacing w:before="120" w:after="120" w:line="320" w:lineRule="exact"/>
         <w:jc w:val="both"/>
       </w:pPr>
       <w:r>
@@ -6610,15 +6610,15 @@
         <w:spacing w:before="240" w:after="120" w:line="320" w:lineRule="exact"/>
         <w:jc w:val="both"/>
       </w:pPr>
-      <w:bookmarkStart w:id="5" w:name="libraries-import"/>
-      <w:bookmarkStart w:id="6" w:name="_Toc225865721"/>
+      <w:bookmarkStart w:id="5" w:name="_Toc225865721"/>
+      <w:bookmarkStart w:id="6" w:name="libraries-import"/>
       <w:r>
         <w:rPr>
           <w:color w:val="4F81BD"/>
         </w:rPr>
         <w:t>2.1 Libraries Import</w:t>
       </w:r>
-      <w:bookmarkEnd w:id="6"/>
+      <w:bookmarkEnd w:id="5"/>
     </w:p>
     <w:p>
       <w:pPr>
@@ -7427,7 +7427,7 @@
         <w:jc w:val="both"/>
       </w:pPr>
       <w:bookmarkStart w:id="7" w:name="gpu-test"/>
-      <w:bookmarkEnd w:id="5"/>
+      <w:bookmarkEnd w:id="6"/>
       <w:r>
         <w:t>We verify that TensorFlow detects the available GPU and configure memory growth to prevent out-of-memory errors during the evolutionary search, which trains many models sequentially.</w:t>
       </w:r>
@@ -8357,15 +8357,15 @@
         <w:spacing w:before="240" w:after="120" w:line="320" w:lineRule="exact"/>
         <w:jc w:val="both"/>
       </w:pPr>
-      <w:bookmarkStart w:id="12" w:name="load-data"/>
-      <w:bookmarkStart w:id="13" w:name="_Toc225865724"/>
+      <w:bookmarkStart w:id="12" w:name="_Toc225865724"/>
+      <w:bookmarkStart w:id="13" w:name="load-data"/>
       <w:r>
         <w:rPr>
           <w:color w:val="4F81BD"/>
         </w:rPr>
         <w:t>3.1 Load Data</w:t>
       </w:r>
-      <w:bookmarkEnd w:id="13"/>
+      <w:bookmarkEnd w:id="12"/>
     </w:p>
     <w:p>
       <w:pPr>
@@ -8383,16 +8383,16 @@
         <w:spacing w:before="240" w:after="120" w:line="320" w:lineRule="exact"/>
         <w:jc w:val="both"/>
       </w:pPr>
-      <w:bookmarkStart w:id="14" w:name="initial-dataset-inspection"/>
-      <w:bookmarkStart w:id="15" w:name="_Toc225865725"/>
-      <w:bookmarkEnd w:id="12"/>
+      <w:bookmarkStart w:id="14" w:name="_Toc225865725"/>
+      <w:bookmarkStart w:id="15" w:name="initial-dataset-inspection"/>
+      <w:bookmarkEnd w:id="13"/>
       <w:r>
         <w:rPr>
           <w:color w:val="4F81BD"/>
         </w:rPr>
         <w:t>3.2 Initial Dataset Inspection</w:t>
       </w:r>
-      <w:bookmarkEnd w:id="15"/>
+      <w:bookmarkEnd w:id="14"/>
     </w:p>
     <w:p>
       <w:pPr>
@@ -8898,9 +8898,9 @@
         <w:spacing w:before="240" w:after="120" w:line="320" w:lineRule="exact"/>
         <w:jc w:val="both"/>
       </w:pPr>
-      <w:bookmarkStart w:id="16" w:name="datetime-parsing-and-temporal-ordering"/>
-      <w:bookmarkStart w:id="17" w:name="_Toc225865726"/>
-      <w:bookmarkEnd w:id="14"/>
+      <w:bookmarkStart w:id="16" w:name="_Toc225865726"/>
+      <w:bookmarkStart w:id="17" w:name="datetime-parsing-and-temporal-ordering"/>
+      <w:bookmarkEnd w:id="15"/>
       <w:r>
         <w:rPr>
           <w:color w:val="4F81BD"/>
@@ -8908,7 +8908,7 @@
         <w:lastRenderedPageBreak/>
         <w:t>3.3 Datetime Parsing and Temporal Ordering</w:t>
       </w:r>
-      <w:bookmarkEnd w:id="17"/>
+      <w:bookmarkEnd w:id="16"/>
     </w:p>
     <w:p>
       <w:pPr>
@@ -9291,16 +9291,16 @@
         <w:spacing w:before="240" w:after="120" w:line="320" w:lineRule="exact"/>
         <w:jc w:val="both"/>
       </w:pPr>
-      <w:bookmarkStart w:id="18" w:name="hourly-resampling"/>
-      <w:bookmarkStart w:id="19" w:name="_Toc225865727"/>
-      <w:bookmarkEnd w:id="16"/>
+      <w:bookmarkStart w:id="18" w:name="_Toc225865727"/>
+      <w:bookmarkStart w:id="19" w:name="hourly-resampling"/>
+      <w:bookmarkEnd w:id="17"/>
       <w:r>
         <w:rPr>
           <w:color w:val="4F81BD"/>
         </w:rPr>
         <w:t>3.4 Hourly Resampling</w:t>
       </w:r>
-      <w:bookmarkEnd w:id="19"/>
+      <w:bookmarkEnd w:id="18"/>
     </w:p>
     <w:p>
       <w:pPr>
@@ -9355,16 +9355,16 @@
         <w:spacing w:before="240" w:after="120" w:line="320" w:lineRule="exact"/>
         <w:jc w:val="both"/>
       </w:pPr>
-      <w:bookmarkStart w:id="20" w:name="post-resampling-quality-check"/>
-      <w:bookmarkStart w:id="21" w:name="_Toc225865728"/>
-      <w:bookmarkEnd w:id="18"/>
+      <w:bookmarkStart w:id="20" w:name="_Toc225865728"/>
+      <w:bookmarkStart w:id="21" w:name="post-resampling-quality-check"/>
+      <w:bookmarkEnd w:id="19"/>
       <w:r>
         <w:rPr>
           <w:color w:val="4F81BD"/>
         </w:rPr>
         <w:t>3.5 Post-Resampling Quality Check</w:t>
       </w:r>
-      <w:bookmarkEnd w:id="21"/>
+      <w:bookmarkEnd w:id="20"/>
     </w:p>
     <w:p>
       <w:pPr>
@@ -9398,16 +9398,16 @@
         <w:spacing w:before="240" w:after="120" w:line="320" w:lineRule="exact"/>
         <w:jc w:val="both"/>
       </w:pPr>
-      <w:bookmarkStart w:id="22" w:name="handling-missing-values-after-resampling"/>
-      <w:bookmarkStart w:id="23" w:name="_Toc225865729"/>
-      <w:bookmarkEnd w:id="20"/>
+      <w:bookmarkStart w:id="22" w:name="_Toc225865729"/>
+      <w:bookmarkStart w:id="23" w:name="handling-missing-values-after-resampling"/>
+      <w:bookmarkEnd w:id="21"/>
       <w:r>
         <w:rPr>
           <w:color w:val="4F81BD"/>
         </w:rPr>
         <w:t>3.6 Handling Missing Values After Resampling</w:t>
       </w:r>
-      <w:bookmarkEnd w:id="23"/>
+      <w:bookmarkEnd w:id="22"/>
     </w:p>
     <w:p>
       <w:pPr>
@@ -9433,16 +9433,16 @@
         <w:spacing w:before="240" w:after="120" w:line="320" w:lineRule="exact"/>
         <w:jc w:val="both"/>
       </w:pPr>
-      <w:bookmarkStart w:id="24" w:name="forecasting-task-and-variable-selection"/>
-      <w:bookmarkStart w:id="25" w:name="_Toc225865730"/>
-      <w:bookmarkEnd w:id="22"/>
+      <w:bookmarkStart w:id="24" w:name="_Toc225865730"/>
+      <w:bookmarkStart w:id="25" w:name="forecasting-task-and-variable-selection"/>
+      <w:bookmarkEnd w:id="23"/>
       <w:r>
         <w:rPr>
           <w:color w:val="4F81BD"/>
         </w:rPr>
         <w:t>3.7 Forecasting Task and Variable Selection</w:t>
       </w:r>
-      <w:bookmarkEnd w:id="25"/>
+      <w:bookmarkEnd w:id="24"/>
     </w:p>
     <w:p>
       <w:pPr>
@@ -10687,7 +10687,7 @@
       </w:pPr>
       <w:bookmarkStart w:id="26" w:name="data-initial-preparation"/>
       <w:bookmarkEnd w:id="10"/>
-      <w:bookmarkEnd w:id="24"/>
+      <w:bookmarkEnd w:id="25"/>
     </w:p>
     <w:p>
       <w:pPr>
@@ -10738,8 +10738,8 @@
         <w:spacing w:before="240" w:after="120" w:line="320" w:lineRule="exact"/>
         <w:jc w:val="both"/>
       </w:pPr>
-      <w:bookmarkStart w:id="28" w:name="Xe37e312ecad896257e65cbc3de33c9a7eb1f93b"/>
-      <w:bookmarkStart w:id="29" w:name="_Toc225865732"/>
+      <w:bookmarkStart w:id="28" w:name="_Toc225865732"/>
+      <w:bookmarkStart w:id="29" w:name="Xe37e312ecad896257e65cbc3de33c9a7eb1f93b"/>
       <w:r>
         <w:rPr>
           <w:color w:val="4F81BD"/>
@@ -10753,7 +10753,7 @@
         </w:rPr>
         <w:t>DataFrame</w:t>
       </w:r>
-      <w:bookmarkEnd w:id="29"/>
+      <w:bookmarkEnd w:id="28"/>
       <w:proofErr w:type="spellEnd"/>
     </w:p>
     <w:p>
@@ -10858,16 +10858,16 @@
         <w:spacing w:before="240" w:after="120" w:line="320" w:lineRule="exact"/>
         <w:jc w:val="both"/>
       </w:pPr>
-      <w:bookmarkStart w:id="30" w:name="base-forecasting-data-overview"/>
-      <w:bookmarkStart w:id="31" w:name="_Toc225865733"/>
-      <w:bookmarkEnd w:id="28"/>
+      <w:bookmarkStart w:id="30" w:name="_Toc225865733"/>
+      <w:bookmarkStart w:id="31" w:name="base-forecasting-data-overview"/>
+      <w:bookmarkEnd w:id="29"/>
       <w:r>
         <w:rPr>
           <w:color w:val="4F81BD"/>
         </w:rPr>
         <w:t>4.2 Base Forecasting Data Overview</w:t>
       </w:r>
-      <w:bookmarkEnd w:id="31"/>
+      <w:bookmarkEnd w:id="30"/>
     </w:p>
     <w:p>
       <w:pPr>
@@ -10915,7 +10915,7 @@
       </w:pPr>
       <w:bookmarkStart w:id="32" w:name="feature-engineering"/>
       <w:bookmarkEnd w:id="26"/>
-      <w:bookmarkEnd w:id="30"/>
+      <w:bookmarkEnd w:id="31"/>
       <w:r>
         <w:rPr>
           <w:color w:val="4F81BD"/>
@@ -11015,15 +11015,15 @@
         <w:spacing w:before="240" w:after="120" w:line="320" w:lineRule="exact"/>
         <w:jc w:val="both"/>
       </w:pPr>
-      <w:bookmarkStart w:id="34" w:name="cyclical-time-features"/>
-      <w:bookmarkStart w:id="35" w:name="_Toc225865735"/>
+      <w:bookmarkStart w:id="34" w:name="_Toc225865735"/>
+      <w:bookmarkStart w:id="35" w:name="cyclical-time-features"/>
       <w:r>
         <w:rPr>
           <w:color w:val="4F81BD"/>
         </w:rPr>
         <w:t>5.1 Cyclical Time Features</w:t>
       </w:r>
-      <w:bookmarkEnd w:id="35"/>
+      <w:bookmarkEnd w:id="34"/>
     </w:p>
     <w:p>
       <w:pPr>
@@ -12198,16 +12198,16 @@
         <w:spacing w:before="240" w:after="120" w:line="320" w:lineRule="exact"/>
         <w:jc w:val="both"/>
       </w:pPr>
-      <w:bookmarkStart w:id="36" w:name="wind-derived-features"/>
-      <w:bookmarkStart w:id="37" w:name="_Toc225865736"/>
-      <w:bookmarkEnd w:id="34"/>
+      <w:bookmarkStart w:id="36" w:name="_Toc225865736"/>
+      <w:bookmarkStart w:id="37" w:name="wind-derived-features"/>
+      <w:bookmarkEnd w:id="35"/>
       <w:r>
         <w:rPr>
           <w:color w:val="4F81BD"/>
         </w:rPr>
         <w:t>5.2 Wind-Derived Features</w:t>
       </w:r>
-      <w:bookmarkEnd w:id="37"/>
+      <w:bookmarkEnd w:id="36"/>
     </w:p>
     <w:p>
       <w:pPr>
@@ -14053,16 +14053,16 @@
         <w:spacing w:before="240" w:after="120" w:line="320" w:lineRule="exact"/>
         <w:jc w:val="both"/>
       </w:pPr>
-      <w:bookmarkStart w:id="38" w:name="final-feature-set-for-modeling"/>
-      <w:bookmarkStart w:id="39" w:name="_Toc225865737"/>
-      <w:bookmarkEnd w:id="36"/>
+      <w:bookmarkStart w:id="38" w:name="_Toc225865737"/>
+      <w:bookmarkStart w:id="39" w:name="final-feature-set-for-modeling"/>
+      <w:bookmarkEnd w:id="37"/>
       <w:r>
         <w:rPr>
           <w:color w:val="4F81BD"/>
         </w:rPr>
         <w:t>5.3 Final Feature Set for Modeling</w:t>
       </w:r>
-      <w:bookmarkEnd w:id="39"/>
+      <w:bookmarkEnd w:id="38"/>
     </w:p>
     <w:p>
       <w:pPr>
@@ -14452,7 +14452,7 @@
       </w:pPr>
       <w:bookmarkStart w:id="40" w:name="split-scaling-and-windowing"/>
       <w:bookmarkEnd w:id="32"/>
-      <w:bookmarkEnd w:id="38"/>
+      <w:bookmarkEnd w:id="39"/>
       <w:r>
         <w:t>The XAI analysis in Section 11 later evaluates which of these 16 features contribute most, leading to a pruned 11-feature variant.</w:t>
       </w:r>
@@ -14514,15 +14514,15 @@
         <w:spacing w:before="240" w:after="120" w:line="320" w:lineRule="exact"/>
         <w:jc w:val="both"/>
       </w:pPr>
-      <w:bookmarkStart w:id="42" w:name="temporal-trainvalidationtest-split"/>
-      <w:bookmarkStart w:id="43" w:name="_Toc225865739"/>
+      <w:bookmarkStart w:id="42" w:name="_Toc225865739"/>
+      <w:bookmarkStart w:id="43" w:name="temporal-trainvalidationtest-split"/>
       <w:r>
         <w:rPr>
           <w:color w:val="4F81BD"/>
         </w:rPr>
         <w:t>6.1 Temporal Train/Validation/Test Split</w:t>
       </w:r>
-      <w:bookmarkEnd w:id="43"/>
+      <w:bookmarkEnd w:id="42"/>
     </w:p>
     <w:p>
       <w:pPr>
@@ -14556,16 +14556,16 @@
         <w:spacing w:before="240" w:after="120" w:line="320" w:lineRule="exact"/>
         <w:jc w:val="both"/>
       </w:pPr>
-      <w:bookmarkStart w:id="44" w:name="feature-scaling"/>
-      <w:bookmarkStart w:id="45" w:name="_Toc225865740"/>
-      <w:bookmarkEnd w:id="42"/>
+      <w:bookmarkStart w:id="44" w:name="_Toc225865740"/>
+      <w:bookmarkStart w:id="45" w:name="feature-scaling"/>
+      <w:bookmarkEnd w:id="43"/>
       <w:r>
         <w:rPr>
           <w:color w:val="4F81BD"/>
         </w:rPr>
         <w:t>6.2 Feature Scaling</w:t>
       </w:r>
-      <w:bookmarkEnd w:id="45"/>
+      <w:bookmarkEnd w:id="44"/>
     </w:p>
     <w:p>
       <w:pPr>
@@ -14657,16 +14657,16 @@
         <w:spacing w:before="240" w:after="120" w:line="320" w:lineRule="exact"/>
         <w:jc w:val="both"/>
       </w:pPr>
-      <w:bookmarkStart w:id="46" w:name="target-index-for-forecasting"/>
-      <w:bookmarkStart w:id="47" w:name="_Toc225865741"/>
-      <w:bookmarkEnd w:id="44"/>
+      <w:bookmarkStart w:id="46" w:name="_Toc225865741"/>
+      <w:bookmarkStart w:id="47" w:name="target-index-for-forecasting"/>
+      <w:bookmarkEnd w:id="45"/>
       <w:r>
         <w:rPr>
           <w:color w:val="4F81BD"/>
         </w:rPr>
         <w:t>6.3 Target Index for Forecasting</w:t>
       </w:r>
-      <w:bookmarkEnd w:id="47"/>
+      <w:bookmarkEnd w:id="46"/>
     </w:p>
     <w:p>
       <w:pPr>
@@ -14733,16 +14733,16 @@
         <w:spacing w:before="240" w:after="120" w:line="320" w:lineRule="exact"/>
         <w:jc w:val="both"/>
       </w:pPr>
-      <w:bookmarkStart w:id="48" w:name="supervised-windowing"/>
-      <w:bookmarkStart w:id="49" w:name="_Toc225865742"/>
-      <w:bookmarkEnd w:id="46"/>
+      <w:bookmarkStart w:id="48" w:name="_Toc225865742"/>
+      <w:bookmarkStart w:id="49" w:name="supervised-windowing"/>
+      <w:bookmarkEnd w:id="47"/>
       <w:r>
         <w:rPr>
           <w:color w:val="4F81BD"/>
         </w:rPr>
         <w:t>6.4 Supervised Windowing</w:t>
       </w:r>
-      <w:bookmarkEnd w:id="49"/>
+      <w:bookmarkEnd w:id="48"/>
     </w:p>
     <w:p>
       <w:pPr>
@@ -14864,9 +14864,9 @@
         <w:spacing w:before="240" w:after="120" w:line="320" w:lineRule="exact"/>
         <w:jc w:val="both"/>
       </w:pPr>
-      <w:bookmarkStart w:id="50" w:name="windowed-data-sanity-check"/>
-      <w:bookmarkStart w:id="51" w:name="_Toc225865743"/>
-      <w:bookmarkEnd w:id="48"/>
+      <w:bookmarkStart w:id="50" w:name="_Toc225865743"/>
+      <w:bookmarkStart w:id="51" w:name="windowed-data-sanity-check"/>
+      <w:bookmarkEnd w:id="49"/>
       <w:r>
         <w:rPr>
           <w:color w:val="4F81BD"/>
@@ -14874,7 +14874,7 @@
         <w:lastRenderedPageBreak/>
         <w:t>6.5 Windowed Data Sanity Check</w:t>
       </w:r>
-      <w:bookmarkEnd w:id="51"/>
+      <w:bookmarkEnd w:id="50"/>
     </w:p>
     <w:p>
       <w:pPr>
@@ -15459,7 +15459,7 @@
       </w:pPr>
       <w:bookmarkStart w:id="52" w:name="baseline-models"/>
       <w:bookmarkEnd w:id="40"/>
-      <w:bookmarkEnd w:id="50"/>
+      <w:bookmarkEnd w:id="51"/>
       <w:r>
         <w:rPr>
           <w:color w:val="4F81BD"/>
@@ -15534,15 +15534,15 @@
         <w:spacing w:before="240" w:after="120" w:line="320" w:lineRule="exact"/>
         <w:jc w:val="both"/>
       </w:pPr>
-      <w:bookmarkStart w:id="54" w:name="persistence-baseline"/>
-      <w:bookmarkStart w:id="55" w:name="_Toc225865745"/>
+      <w:bookmarkStart w:id="54" w:name="_Toc225865745"/>
+      <w:bookmarkStart w:id="55" w:name="persistence-baseline"/>
       <w:r>
         <w:rPr>
           <w:color w:val="4F81BD"/>
         </w:rPr>
         <w:t>7.1 Persistence Baseline</w:t>
       </w:r>
-      <w:bookmarkEnd w:id="55"/>
+      <w:bookmarkEnd w:id="54"/>
     </w:p>
     <w:p>
       <w:pPr>
@@ -16247,16 +16247,16 @@
         <w:spacing w:before="240" w:after="120" w:line="320" w:lineRule="exact"/>
         <w:jc w:val="both"/>
       </w:pPr>
-      <w:bookmarkStart w:id="56" w:name="gru-baseline"/>
-      <w:bookmarkStart w:id="57" w:name="_Toc225865746"/>
-      <w:bookmarkEnd w:id="54"/>
+      <w:bookmarkStart w:id="56" w:name="_Toc225865746"/>
+      <w:bookmarkStart w:id="57" w:name="gru-baseline"/>
+      <w:bookmarkEnd w:id="55"/>
       <w:r>
         <w:rPr>
           <w:color w:val="4F81BD"/>
         </w:rPr>
         <w:t>7.2 GRU Baseline</w:t>
       </w:r>
-      <w:bookmarkEnd w:id="57"/>
+      <w:bookmarkEnd w:id="56"/>
     </w:p>
     <w:p>
       <w:pPr>
@@ -16727,16 +16727,16 @@
         <w:spacing w:before="240" w:after="120" w:line="320" w:lineRule="exact"/>
         <w:jc w:val="both"/>
       </w:pPr>
-      <w:bookmarkStart w:id="58" w:name="baseline-comparison"/>
-      <w:bookmarkStart w:id="59" w:name="_Toc225865747"/>
-      <w:bookmarkEnd w:id="56"/>
+      <w:bookmarkStart w:id="58" w:name="_Toc225865747"/>
+      <w:bookmarkStart w:id="59" w:name="baseline-comparison"/>
+      <w:bookmarkEnd w:id="57"/>
       <w:r>
         <w:rPr>
           <w:color w:val="4F81BD"/>
         </w:rPr>
         <w:t>7.3 Baseline Comparison</w:t>
       </w:r>
-      <w:bookmarkEnd w:id="59"/>
+      <w:bookmarkEnd w:id="58"/>
     </w:p>
     <w:p>
       <w:pPr>
@@ -17081,9 +17081,9 @@
         <w:spacing w:before="240" w:after="120" w:line="320" w:lineRule="exact"/>
         <w:jc w:val="both"/>
       </w:pPr>
-      <w:bookmarkStart w:id="60" w:name="reverse-scaling"/>
-      <w:bookmarkStart w:id="61" w:name="_Toc225865748"/>
-      <w:bookmarkEnd w:id="58"/>
+      <w:bookmarkStart w:id="60" w:name="_Toc225865748"/>
+      <w:bookmarkStart w:id="61" w:name="reverse-scaling"/>
+      <w:bookmarkEnd w:id="59"/>
       <w:r>
         <w:rPr>
           <w:color w:val="4F81BD"/>
@@ -17091,7 +17091,7 @@
         <w:lastRenderedPageBreak/>
         <w:t>7.4 Reverse Scaling</w:t>
       </w:r>
-      <w:bookmarkEnd w:id="61"/>
+      <w:bookmarkEnd w:id="60"/>
     </w:p>
     <w:p>
       <w:pPr>
@@ -17305,16 +17305,16 @@
         <w:spacing w:before="240" w:after="120" w:line="320" w:lineRule="exact"/>
         <w:jc w:val="both"/>
       </w:pPr>
-      <w:bookmarkStart w:id="62" w:name="X6f1755b321664b0ae525a5cb32afdf6932d140c"/>
-      <w:bookmarkStart w:id="63" w:name="_Toc225865749"/>
-      <w:bookmarkEnd w:id="60"/>
+      <w:bookmarkStart w:id="62" w:name="_Toc225865749"/>
+      <w:bookmarkStart w:id="63" w:name="X6f1755b321664b0ae525a5cb32afdf6932d140c"/>
+      <w:bookmarkEnd w:id="61"/>
       <w:r>
         <w:rPr>
           <w:color w:val="4F81BD"/>
         </w:rPr>
         <w:t>7.5 Baseline Evaluation in Original Temperature Scale</w:t>
       </w:r>
-      <w:bookmarkEnd w:id="63"/>
+      <w:bookmarkEnd w:id="62"/>
     </w:p>
     <w:p>
       <w:pPr>
@@ -17478,16 +17478,16 @@
         <w:spacing w:before="240" w:after="120" w:line="320" w:lineRule="exact"/>
         <w:jc w:val="both"/>
       </w:pPr>
-      <w:bookmarkStart w:id="64" w:name="final-baseline-comparison"/>
-      <w:bookmarkStart w:id="65" w:name="_Toc225865750"/>
-      <w:bookmarkEnd w:id="62"/>
+      <w:bookmarkStart w:id="64" w:name="_Toc225865750"/>
+      <w:bookmarkStart w:id="65" w:name="final-baseline-comparison"/>
+      <w:bookmarkEnd w:id="63"/>
       <w:r>
         <w:rPr>
           <w:color w:val="4F81BD"/>
         </w:rPr>
         <w:t>7.6 Final Baseline Comparison</w:t>
       </w:r>
-      <w:bookmarkEnd w:id="65"/>
+      <w:bookmarkEnd w:id="64"/>
     </w:p>
     <w:p>
       <w:pPr>
@@ -17958,16 +17958,16 @@
         <w:spacing w:before="240" w:after="120" w:line="320" w:lineRule="exact"/>
         <w:jc w:val="both"/>
       </w:pPr>
-      <w:bookmarkStart w:id="66" w:name="forecast-visualization"/>
-      <w:bookmarkStart w:id="67" w:name="_Toc225865751"/>
-      <w:bookmarkEnd w:id="64"/>
+      <w:bookmarkStart w:id="66" w:name="_Toc225865751"/>
+      <w:bookmarkStart w:id="67" w:name="forecast-visualization"/>
+      <w:bookmarkEnd w:id="65"/>
       <w:r>
         <w:rPr>
           <w:color w:val="4F81BD"/>
         </w:rPr>
         <w:t>7.6 Forecast Visualization</w:t>
       </w:r>
-      <w:bookmarkEnd w:id="67"/>
+      <w:bookmarkEnd w:id="66"/>
     </w:p>
     <w:p>
       <w:pPr>
@@ -18075,7 +18075,7 @@
       </w:pPr>
       <w:bookmarkStart w:id="68" w:name="synthetic-data-generation-with-timegan"/>
       <w:bookmarkEnd w:id="52"/>
-      <w:bookmarkEnd w:id="66"/>
+      <w:bookmarkEnd w:id="67"/>
       <w:r>
         <w:rPr>
           <w:color w:val="4F81BD"/>
@@ -18116,15 +18116,15 @@
         <w:spacing w:before="240" w:after="120" w:line="320" w:lineRule="exact"/>
         <w:jc w:val="both"/>
       </w:pPr>
-      <w:bookmarkStart w:id="70" w:name="motivation-and-experimental-role"/>
-      <w:bookmarkStart w:id="71" w:name="_Toc225865753"/>
+      <w:bookmarkStart w:id="70" w:name="_Toc225865753"/>
+      <w:bookmarkStart w:id="71" w:name="motivation-and-experimental-role"/>
       <w:r>
         <w:rPr>
           <w:color w:val="4F81BD"/>
         </w:rPr>
         <w:t>8.1 Motivation and Experimental Role</w:t>
       </w:r>
-      <w:bookmarkEnd w:id="71"/>
+      <w:bookmarkEnd w:id="70"/>
     </w:p>
     <w:p>
       <w:pPr>
@@ -18210,16 +18210,16 @@
         <w:spacing w:before="240" w:after="120" w:line="320" w:lineRule="exact"/>
         <w:jc w:val="both"/>
       </w:pPr>
-      <w:bookmarkStart w:id="72" w:name="timegan-training-data-preparation"/>
-      <w:bookmarkStart w:id="73" w:name="_Toc225865754"/>
-      <w:bookmarkEnd w:id="70"/>
+      <w:bookmarkStart w:id="72" w:name="_Toc225865754"/>
+      <w:bookmarkStart w:id="73" w:name="timegan-training-data-preparation"/>
+      <w:bookmarkEnd w:id="71"/>
       <w:r>
         <w:rPr>
           <w:color w:val="4F81BD"/>
         </w:rPr>
         <w:t>8.2 TimeGAN Training Data Preparation</w:t>
       </w:r>
-      <w:bookmarkEnd w:id="73"/>
+      <w:bookmarkEnd w:id="72"/>
     </w:p>
     <w:p>
       <w:pPr>
@@ -18401,16 +18401,16 @@
         <w:spacing w:before="240" w:after="120" w:line="320" w:lineRule="exact"/>
         <w:jc w:val="both"/>
       </w:pPr>
-      <w:bookmarkStart w:id="74" w:name="timegan-model-and-training-procedure"/>
-      <w:bookmarkStart w:id="75" w:name="_Toc225865755"/>
-      <w:bookmarkEnd w:id="72"/>
+      <w:bookmarkStart w:id="74" w:name="_Toc225865755"/>
+      <w:bookmarkStart w:id="75" w:name="timegan-model-and-training-procedure"/>
+      <w:bookmarkEnd w:id="73"/>
       <w:r>
         <w:rPr>
           <w:color w:val="4F81BD"/>
         </w:rPr>
         <w:t>8.3 TimeGAN Model and Training Procedure</w:t>
       </w:r>
-      <w:bookmarkEnd w:id="75"/>
+      <w:bookmarkEnd w:id="74"/>
     </w:p>
     <w:p>
       <w:pPr>
@@ -19681,9 +19681,9 @@
         <w:spacing w:before="240" w:after="120" w:line="320" w:lineRule="exact"/>
         <w:jc w:val="both"/>
       </w:pPr>
-      <w:bookmarkStart w:id="81" w:name="synthetic-sequence-quality-assessment"/>
-      <w:bookmarkStart w:id="82" w:name="_Toc225865756"/>
-      <w:bookmarkEnd w:id="74"/>
+      <w:bookmarkStart w:id="81" w:name="_Toc225865756"/>
+      <w:bookmarkStart w:id="82" w:name="synthetic-sequence-quality-assessment"/>
+      <w:bookmarkEnd w:id="75"/>
       <w:bookmarkEnd w:id="80"/>
       <w:r>
         <w:rPr>
@@ -19691,7 +19691,7 @@
         </w:rPr>
         <w:t>8.4 Synthetic Sequence Quality Assessment</w:t>
       </w:r>
-      <w:bookmarkEnd w:id="82"/>
+      <w:bookmarkEnd w:id="81"/>
     </w:p>
     <w:p>
       <w:pPr>
@@ -20163,10 +20163,10 @@
         <w:spacing w:before="240" w:after="120" w:line="320" w:lineRule="exact"/>
         <w:jc w:val="both"/>
       </w:pPr>
-      <w:bookmarkStart w:id="87" w:name="Xc651f065394dc8a361c152a02a21bc87801aef3"/>
-      <w:bookmarkStart w:id="88" w:name="_Toc225865757"/>
+      <w:bookmarkStart w:id="87" w:name="_Toc225865757"/>
+      <w:bookmarkStart w:id="88" w:name="Xc651f065394dc8a361c152a02a21bc87801aef3"/>
       <w:bookmarkEnd w:id="68"/>
-      <w:bookmarkEnd w:id="81"/>
+      <w:bookmarkEnd w:id="82"/>
       <w:bookmarkEnd w:id="86"/>
       <w:r>
         <w:rPr>
@@ -20176,7 +20176,7 @@
         <w:lastRenderedPageBreak/>
         <w:t>9. Evolutionary Optimization of the Forecasting Pipeline</w:t>
       </w:r>
-      <w:bookmarkEnd w:id="88"/>
+      <w:bookmarkEnd w:id="87"/>
     </w:p>
     <w:p>
       <w:pPr>
@@ -20184,15 +20184,15 @@
         <w:spacing w:before="240" w:after="120" w:line="320" w:lineRule="exact"/>
         <w:jc w:val="both"/>
       </w:pPr>
-      <w:bookmarkStart w:id="89" w:name="motivation-and-search-strategy"/>
-      <w:bookmarkStart w:id="90" w:name="_Toc225865758"/>
+      <w:bookmarkStart w:id="89" w:name="_Toc225865758"/>
+      <w:bookmarkStart w:id="90" w:name="motivation-and-search-strategy"/>
       <w:r>
         <w:rPr>
           <w:color w:val="4F81BD"/>
         </w:rPr>
         <w:t>9.1 Motivation and Search Strategy</w:t>
       </w:r>
-      <w:bookmarkEnd w:id="90"/>
+      <w:bookmarkEnd w:id="89"/>
     </w:p>
     <w:p>
       <w:pPr>
@@ -20306,16 +20306,16 @@
         <w:spacing w:before="240" w:after="120" w:line="320" w:lineRule="exact"/>
         <w:jc w:val="both"/>
       </w:pPr>
-      <w:bookmarkStart w:id="91" w:name="search-space-definition"/>
-      <w:bookmarkStart w:id="92" w:name="_Toc225865759"/>
-      <w:bookmarkEnd w:id="89"/>
+      <w:bookmarkStart w:id="91" w:name="_Toc225865759"/>
+      <w:bookmarkStart w:id="92" w:name="search-space-definition"/>
+      <w:bookmarkEnd w:id="90"/>
       <w:r>
         <w:rPr>
           <w:color w:val="4F81BD"/>
         </w:rPr>
         <w:t>9.2 Search Space Definition</w:t>
       </w:r>
-      <w:bookmarkEnd w:id="92"/>
+      <w:bookmarkEnd w:id="91"/>
     </w:p>
     <w:p>
       <w:pPr>
@@ -20514,9 +20514,9 @@
         <w:spacing w:before="240" w:after="120" w:line="320" w:lineRule="exact"/>
         <w:jc w:val="both"/>
       </w:pPr>
-      <w:bookmarkStart w:id="94" w:name="X3145f2ab4d6abe96b7e03d1718810d7358edf4c"/>
-      <w:bookmarkStart w:id="95" w:name="_Toc225865760"/>
-      <w:bookmarkEnd w:id="91"/>
+      <w:bookmarkStart w:id="94" w:name="_Toc225865760"/>
+      <w:bookmarkStart w:id="95" w:name="X3145f2ab4d6abe96b7e03d1718810d7358edf4c"/>
+      <w:bookmarkEnd w:id="92"/>
       <w:bookmarkEnd w:id="93"/>
       <w:r>
         <w:rPr>
@@ -20525,7 +20525,7 @@
         <w:lastRenderedPageBreak/>
         <w:t>9.3 Evolutionary Representation and Constraints</w:t>
       </w:r>
-      <w:bookmarkEnd w:id="95"/>
+      <w:bookmarkEnd w:id="94"/>
     </w:p>
     <w:p>
       <w:pPr>
@@ -21101,16 +21101,16 @@
         <w:spacing w:before="240" w:after="120" w:line="320" w:lineRule="exact"/>
         <w:jc w:val="both"/>
       </w:pPr>
-      <w:bookmarkStart w:id="96" w:name="fitness-function"/>
-      <w:bookmarkStart w:id="97" w:name="_Toc225865761"/>
-      <w:bookmarkEnd w:id="94"/>
+      <w:bookmarkStart w:id="96" w:name="_Toc225865761"/>
+      <w:bookmarkStart w:id="97" w:name="fitness-function"/>
+      <w:bookmarkEnd w:id="95"/>
       <w:r>
         <w:rPr>
           <w:color w:val="4F81BD"/>
         </w:rPr>
         <w:t>9.4 Fitness Function</w:t>
       </w:r>
-      <w:bookmarkEnd w:id="97"/>
+      <w:bookmarkEnd w:id="96"/>
     </w:p>
     <w:p>
       <w:pPr>
@@ -21256,9 +21256,9 @@
         <w:spacing w:before="240" w:after="120" w:line="320" w:lineRule="exact"/>
         <w:jc w:val="both"/>
       </w:pPr>
-      <w:bookmarkStart w:id="98" w:name="evolutionary-search-execution"/>
-      <w:bookmarkStart w:id="99" w:name="_Toc225865762"/>
-      <w:bookmarkEnd w:id="96"/>
+      <w:bookmarkStart w:id="98" w:name="_Toc225865762"/>
+      <w:bookmarkStart w:id="99" w:name="evolutionary-search-execution"/>
+      <w:bookmarkEnd w:id="97"/>
       <w:r>
         <w:rPr>
           <w:color w:val="4F81BD"/>
@@ -21266,7 +21266,7 @@
         <w:lastRenderedPageBreak/>
         <w:t>9.5 Evolutionary Search Execution</w:t>
       </w:r>
-      <w:bookmarkEnd w:id="99"/>
+      <w:bookmarkEnd w:id="98"/>
     </w:p>
     <w:p>
       <w:pPr>
@@ -21335,16 +21335,16 @@
         <w:spacing w:before="240" w:after="120" w:line="320" w:lineRule="exact"/>
         <w:jc w:val="both"/>
       </w:pPr>
-      <w:bookmarkStart w:id="100" w:name="best-configuration-and-retraining"/>
-      <w:bookmarkStart w:id="101" w:name="_Toc225865763"/>
-      <w:bookmarkEnd w:id="98"/>
+      <w:bookmarkStart w:id="100" w:name="_Toc225865763"/>
+      <w:bookmarkStart w:id="101" w:name="best-configuration-and-retraining"/>
+      <w:bookmarkEnd w:id="99"/>
       <w:r>
         <w:rPr>
           <w:color w:val="4F81BD"/>
         </w:rPr>
         <w:t>9.6 Best Configuration and Retraining</w:t>
       </w:r>
-      <w:bookmarkEnd w:id="101"/>
+      <w:bookmarkEnd w:id="100"/>
     </w:p>
     <w:p>
       <w:pPr>
@@ -21923,9 +21923,9 @@
           <w:color w:val="4F81BD"/>
         </w:rPr>
       </w:pPr>
-      <w:bookmarkStart w:id="102" w:name="top-candidate-configurations"/>
-      <w:bookmarkStart w:id="103" w:name="_Toc225865764"/>
-      <w:bookmarkEnd w:id="100"/>
+      <w:bookmarkStart w:id="102" w:name="_Toc225865764"/>
+      <w:bookmarkStart w:id="103" w:name="top-candidate-configurations"/>
+      <w:bookmarkEnd w:id="101"/>
       <w:r>
         <w:rPr>
           <w:rFonts w:eastAsiaTheme="minorEastAsia" w:cstheme="minorBidi"/>
@@ -21941,7 +21941,7 @@
         </w:rPr>
         <w:t xml:space="preserve"> count.</w:t>
       </w:r>
-      <w:bookmarkEnd w:id="103"/>
+      <w:bookmarkEnd w:id="102"/>
     </w:p>
     <w:p>
       <w:pPr>
@@ -22016,8 +22016,8 @@
         <w:t xml:space="preserve"> Top candidate configurations discovered across all EA generations.</w:t>
       </w:r>
       <w:bookmarkStart w:id="105" w:name="retraining-and-final-model-selection"/>
-      <w:bookmarkEnd w:id="87"/>
-      <w:bookmarkEnd w:id="102"/>
+      <w:bookmarkEnd w:id="88"/>
+      <w:bookmarkEnd w:id="103"/>
     </w:p>
     <w:tbl>
       <w:tblPr>
@@ -25647,15 +25647,15 @@
         <w:spacing w:before="240" w:after="120" w:line="320" w:lineRule="exact"/>
         <w:jc w:val="both"/>
       </w:pPr>
-      <w:bookmarkStart w:id="107" w:name="selection-of-final-candidates"/>
-      <w:bookmarkStart w:id="108" w:name="_Toc225865767"/>
+      <w:bookmarkStart w:id="107" w:name="_Toc225865767"/>
+      <w:bookmarkStart w:id="108" w:name="selection-of-final-candidates"/>
       <w:r>
         <w:rPr>
           <w:color w:val="4F81BD"/>
         </w:rPr>
         <w:t>10.1 Selection of Final Candidates</w:t>
       </w:r>
-      <w:bookmarkEnd w:id="108"/>
+      <w:bookmarkEnd w:id="107"/>
     </w:p>
     <w:p>
       <w:pPr>
@@ -25756,7 +25756,7 @@
               </w:rPr>
             </w:pPr>
             <w:bookmarkStart w:id="109" w:name="retraining-procedure"/>
-            <w:bookmarkEnd w:id="107"/>
+            <w:bookmarkEnd w:id="108"/>
             <w:r>
               <w:rPr>
                 <w:sz w:val="22"/>
@@ -27454,22 +27454,7 @@
         <w:jc w:val="both"/>
       </w:pPr>
       <w:r>
-        <w:t xml:space="preserve">Report </w:t>
-      </w:r>
-      <w:r>
-        <w:t xml:space="preserve">upon </w:t>
-      </w:r>
-      <w:r>
-        <w:t>the best validation metrics achieved during evolutionary model training</w:t>
-      </w:r>
-      <w:r>
-        <w:t xml:space="preserve"> and </w:t>
-      </w:r>
-      <w:r>
-        <w:t>the best validation loss and MAE achieved during evolutionary model training</w:t>
-      </w:r>
-      <w:r>
-        <w:t>:</w:t>
+        <w:t>Report upon the best validation metrics achieved during evolutionary model training and the best validation loss and MAE achieved during evolutionary model training:</w:t>
       </w:r>
     </w:p>
     <w:p>
@@ -27613,8 +27598,8 @@
         <w:spacing w:before="240" w:after="120" w:line="320" w:lineRule="exact"/>
         <w:jc w:val="both"/>
       </w:pPr>
-      <w:bookmarkStart w:id="111" w:name="final-test-set-evaluation"/>
-      <w:bookmarkStart w:id="112" w:name="_Toc225865769"/>
+      <w:bookmarkStart w:id="111" w:name="_Toc225865769"/>
+      <w:bookmarkStart w:id="112" w:name="final-test-set-evaluation"/>
       <w:bookmarkEnd w:id="109"/>
       <w:r>
         <w:rPr>
@@ -27622,7 +27607,7 @@
         </w:rPr>
         <w:t>10.3 Final Test Set Evaluation</w:t>
       </w:r>
-      <w:bookmarkEnd w:id="112"/>
+      <w:bookmarkEnd w:id="111"/>
     </w:p>
     <w:p>
       <w:pPr>
@@ -28677,9 +28662,9 @@
         <w:spacing w:before="240" w:after="120" w:line="320" w:lineRule="exact"/>
         <w:jc w:val="both"/>
       </w:pPr>
-      <w:bookmarkStart w:id="116" w:name="final-model-comparison"/>
-      <w:bookmarkStart w:id="117" w:name="_Toc225865770"/>
-      <w:bookmarkEnd w:id="111"/>
+      <w:bookmarkStart w:id="116" w:name="_Toc225865770"/>
+      <w:bookmarkStart w:id="117" w:name="final-model-comparison"/>
+      <w:bookmarkEnd w:id="112"/>
       <w:bookmarkEnd w:id="115"/>
       <w:r>
         <w:rPr>
@@ -28688,7 +28673,7 @@
         <w:lastRenderedPageBreak/>
         <w:t>10.4 Final Model Comparison</w:t>
       </w:r>
-      <w:bookmarkEnd w:id="117"/>
+      <w:bookmarkEnd w:id="116"/>
     </w:p>
     <w:p>
       <w:pPr>
@@ -29149,16 +29134,16 @@
         <w:spacing w:before="240" w:after="120" w:line="320" w:lineRule="exact"/>
         <w:jc w:val="both"/>
       </w:pPr>
-      <w:bookmarkStart w:id="118" w:name="final-model-selection"/>
-      <w:bookmarkStart w:id="119" w:name="_Toc225865771"/>
-      <w:bookmarkEnd w:id="116"/>
+      <w:bookmarkStart w:id="118" w:name="_Toc225865771"/>
+      <w:bookmarkStart w:id="119" w:name="final-model-selection"/>
+      <w:bookmarkEnd w:id="117"/>
       <w:r>
         <w:rPr>
           <w:color w:val="4F81BD"/>
         </w:rPr>
         <w:t>10.5 Final Model Selection</w:t>
       </w:r>
-      <w:bookmarkEnd w:id="119"/>
+      <w:bookmarkEnd w:id="118"/>
     </w:p>
     <w:p>
       <w:pPr>
@@ -29218,16 +29203,16 @@
         <w:spacing w:before="240" w:after="120" w:line="320" w:lineRule="exact"/>
         <w:jc w:val="both"/>
       </w:pPr>
-      <w:bookmarkStart w:id="120" w:name="robustness-across-random-seeds"/>
-      <w:bookmarkStart w:id="121" w:name="_Toc225865772"/>
-      <w:bookmarkEnd w:id="118"/>
+      <w:bookmarkStart w:id="120" w:name="_Toc225865772"/>
+      <w:bookmarkStart w:id="121" w:name="robustness-across-random-seeds"/>
+      <w:bookmarkEnd w:id="119"/>
       <w:r>
         <w:rPr>
           <w:color w:val="4F81BD"/>
         </w:rPr>
         <w:t>10.6 Robustness Across Random Seeds</w:t>
       </w:r>
-      <w:bookmarkEnd w:id="121"/>
+      <w:bookmarkEnd w:id="120"/>
     </w:p>
     <w:p>
       <w:pPr>
@@ -30096,7 +30081,7 @@
       </w:pPr>
       <w:bookmarkStart w:id="122" w:name="explainable-ai"/>
       <w:bookmarkEnd w:id="105"/>
-      <w:bookmarkEnd w:id="120"/>
+      <w:bookmarkEnd w:id="121"/>
       <w:r>
         <w:rPr>
           <w:color w:val="4F81BD"/>
@@ -30167,15 +30152,15 @@
         <w:spacing w:before="240" w:after="120" w:line="320" w:lineRule="exact"/>
         <w:jc w:val="both"/>
       </w:pPr>
-      <w:bookmarkStart w:id="124" w:name="global-explainability"/>
-      <w:bookmarkStart w:id="125" w:name="_Toc225865774"/>
+      <w:bookmarkStart w:id="124" w:name="_Toc225865774"/>
+      <w:bookmarkStart w:id="125" w:name="global-explainability"/>
       <w:r>
         <w:rPr>
           <w:color w:val="4F81BD"/>
         </w:rPr>
         <w:t>11.1 Global Explainability</w:t>
       </w:r>
-      <w:bookmarkEnd w:id="125"/>
+      <w:bookmarkEnd w:id="124"/>
     </w:p>
     <w:p>
       <w:pPr>
@@ -31808,16 +31793,16 @@
         <w:spacing w:before="240" w:after="120" w:line="320" w:lineRule="exact"/>
         <w:jc w:val="both"/>
       </w:pPr>
-      <w:bookmarkStart w:id="126" w:name="local-explainability"/>
-      <w:bookmarkStart w:id="127" w:name="_Toc225865775"/>
-      <w:bookmarkEnd w:id="124"/>
+      <w:bookmarkStart w:id="126" w:name="_Toc225865775"/>
+      <w:bookmarkStart w:id="127" w:name="local-explainability"/>
+      <w:bookmarkEnd w:id="125"/>
       <w:r>
         <w:rPr>
           <w:color w:val="4F81BD"/>
         </w:rPr>
         <w:t>11.2 Local Explainability</w:t>
       </w:r>
-      <w:bookmarkEnd w:id="127"/>
+      <w:bookmarkEnd w:id="126"/>
     </w:p>
     <w:p>
       <w:pPr>
@@ -33366,9 +33351,9 @@
         <w:spacing w:before="240" w:after="120" w:line="320" w:lineRule="exact"/>
         <w:jc w:val="both"/>
       </w:pPr>
-      <w:bookmarkStart w:id="131" w:name="xai-summary"/>
-      <w:bookmarkStart w:id="132" w:name="_Toc225865776"/>
-      <w:bookmarkEnd w:id="126"/>
+      <w:bookmarkStart w:id="131" w:name="_Toc225865776"/>
+      <w:bookmarkStart w:id="132" w:name="xai-summary"/>
+      <w:bookmarkEnd w:id="127"/>
       <w:bookmarkEnd w:id="130"/>
       <w:r>
         <w:rPr>
@@ -33376,7 +33361,7 @@
         </w:rPr>
         <w:t>11.3 XAI Summary</w:t>
       </w:r>
-      <w:bookmarkEnd w:id="132"/>
+      <w:bookmarkEnd w:id="131"/>
     </w:p>
     <w:p>
       <w:pPr>
@@ -33551,16 +33536,16 @@
         <w:spacing w:before="240" w:after="120" w:line="320" w:lineRule="exact"/>
         <w:jc w:val="both"/>
       </w:pPr>
-      <w:bookmarkStart w:id="133" w:name="xai-guided-feature-pruning"/>
-      <w:bookmarkStart w:id="134" w:name="_Toc225865777"/>
-      <w:bookmarkEnd w:id="131"/>
+      <w:bookmarkStart w:id="133" w:name="_Toc225865777"/>
+      <w:bookmarkStart w:id="134" w:name="xai-guided-feature-pruning"/>
+      <w:bookmarkEnd w:id="132"/>
       <w:r>
         <w:rPr>
           <w:color w:val="4F81BD"/>
         </w:rPr>
         <w:t>11.4 XAI-Guided Feature Pruning</w:t>
       </w:r>
-      <w:bookmarkEnd w:id="134"/>
+      <w:bookmarkEnd w:id="133"/>
     </w:p>
     <w:p>
       <w:pPr>
@@ -35475,16 +35460,16 @@
         <w:spacing w:before="240" w:after="120" w:line="320" w:lineRule="exact"/>
         <w:jc w:val="both"/>
       </w:pPr>
-      <w:bookmarkStart w:id="135" w:name="effect-of-xai-guided-feature-pruning"/>
-      <w:bookmarkStart w:id="136" w:name="_Toc225865778"/>
-      <w:bookmarkEnd w:id="133"/>
+      <w:bookmarkStart w:id="135" w:name="_Toc225865778"/>
+      <w:bookmarkStart w:id="136" w:name="effect-of-xai-guided-feature-pruning"/>
+      <w:bookmarkEnd w:id="134"/>
       <w:r>
         <w:rPr>
           <w:color w:val="4F81BD"/>
         </w:rPr>
         <w:t>11.5 Effect of XAI-Guided Feature Pruning</w:t>
       </w:r>
-      <w:bookmarkEnd w:id="136"/>
+      <w:bookmarkEnd w:id="135"/>
     </w:p>
     <w:p>
       <w:pPr>
@@ -35572,10 +35557,10 @@
         <w:spacing w:before="240" w:after="120" w:line="320" w:lineRule="exact"/>
         <w:jc w:val="both"/>
       </w:pPr>
-      <w:bookmarkStart w:id="137" w:name="efficiency-latency-and-resource-analysis"/>
-      <w:bookmarkStart w:id="138" w:name="_Toc225865779"/>
+      <w:bookmarkStart w:id="137" w:name="_Toc225865779"/>
+      <w:bookmarkStart w:id="138" w:name="efficiency-latency-and-resource-analysis"/>
       <w:bookmarkEnd w:id="122"/>
-      <w:bookmarkEnd w:id="135"/>
+      <w:bookmarkEnd w:id="136"/>
       <w:r>
         <w:rPr>
           <w:rFonts w:ascii="Aptos" w:hAnsi="Aptos"/>
@@ -35583,7 +35568,7 @@
         </w:rPr>
         <w:t>12. Efficiency, Latency and Resource Analysis</w:t>
       </w:r>
-      <w:bookmarkEnd w:id="138"/>
+      <w:bookmarkEnd w:id="137"/>
     </w:p>
     <w:p>
       <w:pPr>
@@ -35601,15 +35586,15 @@
         <w:spacing w:before="240" w:after="120" w:line="320" w:lineRule="exact"/>
         <w:jc w:val="both"/>
       </w:pPr>
-      <w:bookmarkStart w:id="139" w:name="motivation"/>
-      <w:bookmarkStart w:id="140" w:name="_Toc225865780"/>
+      <w:bookmarkStart w:id="139" w:name="_Toc225865780"/>
+      <w:bookmarkStart w:id="140" w:name="motivation"/>
       <w:r>
         <w:rPr>
           <w:color w:val="4F81BD"/>
         </w:rPr>
         <w:t>12.1 Motivation</w:t>
       </w:r>
-      <w:bookmarkEnd w:id="140"/>
+      <w:bookmarkEnd w:id="139"/>
     </w:p>
     <w:p>
       <w:pPr>
@@ -35655,16 +35640,16 @@
         <w:spacing w:before="240" w:after="120" w:line="320" w:lineRule="exact"/>
         <w:jc w:val="both"/>
       </w:pPr>
-      <w:bookmarkStart w:id="141" w:name="models-selected-for-efficiency-analysis"/>
-      <w:bookmarkStart w:id="142" w:name="_Toc225865781"/>
-      <w:bookmarkEnd w:id="139"/>
+      <w:bookmarkStart w:id="141" w:name="_Toc225865781"/>
+      <w:bookmarkStart w:id="142" w:name="models-selected-for-efficiency-analysis"/>
+      <w:bookmarkEnd w:id="140"/>
       <w:r>
         <w:rPr>
           <w:color w:val="4F81BD"/>
         </w:rPr>
         <w:t>12.2 Models Selected for Efficiency Analysis</w:t>
       </w:r>
-      <w:bookmarkEnd w:id="142"/>
+      <w:bookmarkEnd w:id="141"/>
     </w:p>
     <w:p>
       <w:pPr>
@@ -35690,16 +35675,16 @@
         <w:spacing w:before="240" w:after="120" w:line="320" w:lineRule="exact"/>
         <w:jc w:val="both"/>
       </w:pPr>
-      <w:bookmarkStart w:id="143" w:name="training-time"/>
-      <w:bookmarkStart w:id="144" w:name="_Toc225865782"/>
-      <w:bookmarkEnd w:id="141"/>
+      <w:bookmarkStart w:id="143" w:name="_Toc225865782"/>
+      <w:bookmarkStart w:id="144" w:name="training-time"/>
+      <w:bookmarkEnd w:id="142"/>
       <w:r>
         <w:rPr>
           <w:color w:val="4F81BD"/>
         </w:rPr>
         <w:t>12.3 Training Time</w:t>
       </w:r>
-      <w:bookmarkEnd w:id="144"/>
+      <w:bookmarkEnd w:id="143"/>
     </w:p>
     <w:p>
       <w:pPr>
@@ -36056,9 +36041,9 @@
         <w:spacing w:before="240" w:after="120" w:line="320" w:lineRule="exact"/>
         <w:jc w:val="both"/>
       </w:pPr>
-      <w:bookmarkStart w:id="145" w:name="memory-usage-ram-gpu"/>
-      <w:bookmarkStart w:id="146" w:name="_Toc225865783"/>
-      <w:bookmarkEnd w:id="143"/>
+      <w:bookmarkStart w:id="145" w:name="_Toc225865783"/>
+      <w:bookmarkStart w:id="146" w:name="memory-usage-ram-gpu"/>
+      <w:bookmarkEnd w:id="144"/>
       <w:r>
         <w:rPr>
           <w:color w:val="4F81BD"/>
@@ -36066,7 +36051,7 @@
         <w:lastRenderedPageBreak/>
         <w:t>12.4 Memory Usage (RAM / GPU)</w:t>
       </w:r>
-      <w:bookmarkEnd w:id="146"/>
+      <w:bookmarkEnd w:id="145"/>
     </w:p>
     <w:p>
       <w:pPr>
@@ -37094,16 +37079,16 @@
         <w:spacing w:before="240" w:after="120" w:line="320" w:lineRule="exact"/>
         <w:jc w:val="both"/>
       </w:pPr>
-      <w:bookmarkStart w:id="147" w:name="trainable-parameters"/>
-      <w:bookmarkStart w:id="148" w:name="_Toc225865784"/>
-      <w:bookmarkEnd w:id="145"/>
+      <w:bookmarkStart w:id="147" w:name="_Toc225865784"/>
+      <w:bookmarkStart w:id="148" w:name="trainable-parameters"/>
+      <w:bookmarkEnd w:id="146"/>
       <w:r>
         <w:rPr>
           <w:color w:val="4F81BD"/>
         </w:rPr>
         <w:t>12.5 Trainable Parameters</w:t>
       </w:r>
-      <w:bookmarkEnd w:id="148"/>
+      <w:bookmarkEnd w:id="147"/>
     </w:p>
     <w:p>
       <w:pPr>
@@ -37395,16 +37380,16 @@
         <w:spacing w:before="240" w:after="120" w:line="320" w:lineRule="exact"/>
         <w:jc w:val="both"/>
       </w:pPr>
-      <w:bookmarkStart w:id="149" w:name="inference-latency"/>
-      <w:bookmarkStart w:id="150" w:name="_Toc225865785"/>
-      <w:bookmarkEnd w:id="147"/>
+      <w:bookmarkStart w:id="149" w:name="_Toc225865785"/>
+      <w:bookmarkStart w:id="150" w:name="inference-latency"/>
+      <w:bookmarkEnd w:id="148"/>
       <w:r>
         <w:rPr>
           <w:color w:val="4F81BD"/>
         </w:rPr>
         <w:t>12.6 Inference Latency</w:t>
       </w:r>
-      <w:bookmarkEnd w:id="150"/>
+      <w:bookmarkEnd w:id="149"/>
     </w:p>
     <w:p>
       <w:pPr>
@@ -38025,16 +38010,16 @@
         <w:spacing w:before="240" w:after="120" w:line="320" w:lineRule="exact"/>
         <w:jc w:val="both"/>
       </w:pPr>
-      <w:bookmarkStart w:id="151" w:name="efficiency-comparison"/>
-      <w:bookmarkStart w:id="152" w:name="_Toc225865786"/>
-      <w:bookmarkEnd w:id="149"/>
+      <w:bookmarkStart w:id="151" w:name="_Toc225865786"/>
+      <w:bookmarkStart w:id="152" w:name="efficiency-comparison"/>
+      <w:bookmarkEnd w:id="150"/>
       <w:r>
         <w:rPr>
           <w:color w:val="4F81BD"/>
         </w:rPr>
         <w:t>12.7 Efficiency Comparison</w:t>
       </w:r>
-      <w:bookmarkEnd w:id="152"/>
+      <w:bookmarkEnd w:id="151"/>
     </w:p>
     <w:p>
       <w:pPr>
@@ -40390,16 +40375,16 @@
         <w:spacing w:before="240" w:after="120" w:line="320" w:lineRule="exact"/>
         <w:jc w:val="both"/>
       </w:pPr>
-      <w:bookmarkStart w:id="153" w:name="final-efficiency-discussion"/>
-      <w:bookmarkStart w:id="154" w:name="_Toc225865787"/>
-      <w:bookmarkEnd w:id="151"/>
+      <w:bookmarkStart w:id="153" w:name="_Toc225865787"/>
+      <w:bookmarkStart w:id="154" w:name="final-efficiency-discussion"/>
+      <w:bookmarkEnd w:id="152"/>
       <w:r>
         <w:rPr>
           <w:color w:val="4F81BD"/>
         </w:rPr>
         <w:t>12.8 Final Efficiency Discussion</w:t>
       </w:r>
-      <w:bookmarkEnd w:id="154"/>
+      <w:bookmarkEnd w:id="153"/>
     </w:p>
     <w:p>
       <w:pPr>
@@ -40505,8 +40490,8 @@
         </w:rPr>
       </w:pPr>
       <w:bookmarkStart w:id="155" w:name="comparative-discussion"/>
-      <w:bookmarkEnd w:id="137"/>
-      <w:bookmarkEnd w:id="153"/>
+      <w:bookmarkEnd w:id="138"/>
+      <w:bookmarkEnd w:id="154"/>
       <w:r>
         <w:rPr>
           <w:color w:val="4F81BD"/>
@@ -40559,15 +40544,15 @@
           <w:color w:val="4F81BD"/>
         </w:rPr>
       </w:pPr>
-      <w:bookmarkStart w:id="157" w:name="summary-of-results"/>
-      <w:bookmarkStart w:id="158" w:name="_Toc225865789"/>
+      <w:bookmarkStart w:id="157" w:name="_Toc225865789"/>
+      <w:bookmarkStart w:id="158" w:name="summary-of-results"/>
       <w:r>
         <w:rPr>
           <w:color w:val="4F81BD"/>
         </w:rPr>
         <w:t>Summary of Results</w:t>
       </w:r>
-      <w:bookmarkEnd w:id="158"/>
+      <w:bookmarkEnd w:id="157"/>
     </w:p>
     <w:p>
       <w:pPr>
@@ -41166,9 +41151,9 @@
         <w:spacing w:before="240" w:after="120" w:line="320" w:lineRule="exact"/>
         <w:jc w:val="both"/>
       </w:pPr>
-      <w:bookmarkStart w:id="159" w:name="baseline-vs.-ea-optimized-performance"/>
-      <w:bookmarkStart w:id="160" w:name="_Toc225865790"/>
-      <w:bookmarkEnd w:id="157"/>
+      <w:bookmarkStart w:id="159" w:name="_Toc225865790"/>
+      <w:bookmarkStart w:id="160" w:name="baseline-vs.-ea-optimized-performance"/>
+      <w:bookmarkEnd w:id="158"/>
       <w:r>
         <w:rPr>
           <w:color w:val="4F81BD"/>
@@ -41181,7 +41166,7 @@
         </w:rPr>
         <w:t>Baseline vs. EA-Optimized Performance</w:t>
       </w:r>
-      <w:bookmarkEnd w:id="160"/>
+      <w:bookmarkEnd w:id="159"/>
     </w:p>
     <w:p>
       <w:pPr>
@@ -41273,9 +41258,9 @@
         <w:spacing w:before="240" w:after="120" w:line="320" w:lineRule="exact"/>
         <w:jc w:val="both"/>
       </w:pPr>
-      <w:bookmarkStart w:id="161" w:name="impact-of-evolutionary-optimization"/>
-      <w:bookmarkStart w:id="162" w:name="_Toc225865791"/>
-      <w:bookmarkEnd w:id="159"/>
+      <w:bookmarkStart w:id="161" w:name="_Toc225865791"/>
+      <w:bookmarkStart w:id="162" w:name="impact-of-evolutionary-optimization"/>
+      <w:bookmarkEnd w:id="160"/>
       <w:r>
         <w:rPr>
           <w:color w:val="4F81BD"/>
@@ -41288,7 +41273,7 @@
         </w:rPr>
         <w:t>Impact of Evolutionary Optimization</w:t>
       </w:r>
-      <w:bookmarkEnd w:id="162"/>
+      <w:bookmarkEnd w:id="161"/>
     </w:p>
     <w:p>
       <w:pPr>
@@ -41445,9 +41430,9 @@
         <w:spacing w:before="240" w:after="120" w:line="320" w:lineRule="exact"/>
         <w:jc w:val="both"/>
       </w:pPr>
-      <w:bookmarkStart w:id="163" w:name="robustness-validation"/>
-      <w:bookmarkStart w:id="164" w:name="_Toc225865792"/>
-      <w:bookmarkEnd w:id="161"/>
+      <w:bookmarkStart w:id="163" w:name="_Toc225865792"/>
+      <w:bookmarkStart w:id="164" w:name="robustness-validation"/>
+      <w:bookmarkEnd w:id="162"/>
       <w:r>
         <w:rPr>
           <w:color w:val="4F81BD"/>
@@ -41460,7 +41445,7 @@
         </w:rPr>
         <w:t>Robustness Validation</w:t>
       </w:r>
-      <w:bookmarkEnd w:id="164"/>
+      <w:bookmarkEnd w:id="163"/>
     </w:p>
     <w:p>
       <w:pPr>
@@ -41767,9 +41752,9 @@
         <w:spacing w:before="240" w:after="120" w:line="320" w:lineRule="exact"/>
         <w:jc w:val="both"/>
       </w:pPr>
-      <w:bookmarkStart w:id="165" w:name="explainability-insights"/>
-      <w:bookmarkStart w:id="166" w:name="_Toc225865793"/>
-      <w:bookmarkEnd w:id="163"/>
+      <w:bookmarkStart w:id="165" w:name="_Toc225865793"/>
+      <w:bookmarkStart w:id="166" w:name="explainability-insights"/>
+      <w:bookmarkEnd w:id="164"/>
       <w:r>
         <w:rPr>
           <w:color w:val="4F81BD"/>
@@ -41782,7 +41767,7 @@
         </w:rPr>
         <w:t>Explainability Insights</w:t>
       </w:r>
-      <w:bookmarkEnd w:id="166"/>
+      <w:bookmarkEnd w:id="165"/>
     </w:p>
     <w:p>
       <w:pPr>
@@ -41856,9 +41841,9 @@
         <w:spacing w:before="240" w:after="120" w:line="320" w:lineRule="exact"/>
         <w:jc w:val="both"/>
       </w:pPr>
-      <w:bookmarkStart w:id="167" w:name="accuracyefficiency-trade-offs"/>
-      <w:bookmarkStart w:id="168" w:name="_Toc225865794"/>
-      <w:bookmarkEnd w:id="165"/>
+      <w:bookmarkStart w:id="167" w:name="_Toc225865794"/>
+      <w:bookmarkStart w:id="168" w:name="accuracyefficiency-trade-offs"/>
+      <w:bookmarkEnd w:id="166"/>
       <w:r>
         <w:rPr>
           <w:color w:val="4F81BD"/>
@@ -41871,7 +41856,7 @@
         </w:rPr>
         <w:t>Accuracy–Efficiency Trade-offs</w:t>
       </w:r>
-      <w:bookmarkEnd w:id="168"/>
+      <w:bookmarkEnd w:id="167"/>
     </w:p>
     <w:p>
       <w:pPr>
@@ -41895,9 +41880,9 @@
         <w:spacing w:before="240" w:after="120" w:line="320" w:lineRule="exact"/>
         <w:jc w:val="both"/>
       </w:pPr>
-      <w:bookmarkStart w:id="169" w:name="strengths-and-limitations"/>
-      <w:bookmarkStart w:id="170" w:name="_Toc225865795"/>
-      <w:bookmarkEnd w:id="167"/>
+      <w:bookmarkStart w:id="169" w:name="_Toc225865795"/>
+      <w:bookmarkStart w:id="170" w:name="strengths-and-limitations"/>
+      <w:bookmarkEnd w:id="168"/>
       <w:r>
         <w:rPr>
           <w:color w:val="4F81BD"/>
@@ -41910,7 +41895,7 @@
         </w:rPr>
         <w:t>Strengths and Limitations</w:t>
       </w:r>
-      <w:bookmarkEnd w:id="170"/>
+      <w:bookmarkEnd w:id="169"/>
     </w:p>
     <w:p>
       <w:pPr>
@@ -42129,7 +42114,7 @@
       </w:pPr>
       <w:bookmarkStart w:id="171" w:name="conclusion"/>
       <w:bookmarkEnd w:id="155"/>
-      <w:bookmarkEnd w:id="169"/>
+      <w:bookmarkEnd w:id="170"/>
       <w:r>
         <w:rPr>
           <w:color w:val="4F81BD"/>
@@ -42170,8 +42155,8 @@
         <w:spacing w:before="240" w:after="120" w:line="320" w:lineRule="exact"/>
         <w:jc w:val="both"/>
       </w:pPr>
-      <w:bookmarkStart w:id="173" w:name="key-findings"/>
-      <w:bookmarkStart w:id="174" w:name="_Toc225865797"/>
+      <w:bookmarkStart w:id="173" w:name="_Toc225865797"/>
+      <w:bookmarkStart w:id="174" w:name="key-findings"/>
       <w:r>
         <w:rPr>
           <w:color w:val="4F81BD"/>
@@ -42184,7 +42169,7 @@
         </w:rPr>
         <w:t>Key Findings</w:t>
       </w:r>
-      <w:bookmarkEnd w:id="174"/>
+      <w:bookmarkEnd w:id="173"/>
     </w:p>
     <w:p>
       <w:pPr>
@@ -42355,9 +42340,9 @@
         <w:spacing w:before="240" w:after="120" w:line="320" w:lineRule="exact"/>
         <w:jc w:val="both"/>
       </w:pPr>
-      <w:bookmarkStart w:id="175" w:name="xai-driven-model-refinement"/>
-      <w:bookmarkStart w:id="176" w:name="_Toc225865798"/>
-      <w:bookmarkEnd w:id="173"/>
+      <w:bookmarkStart w:id="175" w:name="_Toc225865798"/>
+      <w:bookmarkStart w:id="176" w:name="xai-driven-model-refinement"/>
+      <w:bookmarkEnd w:id="174"/>
       <w:r>
         <w:rPr>
           <w:color w:val="4F81BD"/>
@@ -42370,7 +42355,7 @@
         </w:rPr>
         <w:t>XAI-Driven Model Refinement</w:t>
       </w:r>
-      <w:bookmarkEnd w:id="176"/>
+      <w:bookmarkEnd w:id="175"/>
     </w:p>
     <w:p>
       <w:pPr>
@@ -42481,7 +42466,7 @@
       </w:r>
       <w:bookmarkEnd w:id="1"/>
       <w:bookmarkEnd w:id="171"/>
-      <w:bookmarkEnd w:id="175"/>
+      <w:bookmarkEnd w:id="176"/>
     </w:p>
     <w:sectPr>
       <w:headerReference w:type="default" r:id="rId27"/>

</xml_diff>